<commit_message>
edited logbook aug 8
</commit_message>
<xml_diff>
--- a/Weekly Logs/Matt/Matt Baker - Week 4 Individual Logbook.docx
+++ b/Weekly Logs/Matt/Matt Baker - Week 4 Individual Logbook.docx
@@ -2395,6 +2395,21 @@
       </w:r>
       <w:bookmarkEnd w:id="2"/>
     </w:p>
+    <w:p>
+      <w:r>
+        <w:t>Friday, August 7</w:t>
+      </w:r>
+    </w:p>
+    <w:p>
+      <w:r>
+        <w:t>10:15 – 12:45 (2hrs 30 mins)</w:t>
+      </w:r>
+    </w:p>
+    <w:p>
+      <w:r>
+        <w:t>Working through the proposal with the team, generally restructuring, reformatting, and editing out/modifying irrelevant parts, ensuring everything required is in the document</w:t>
+      </w:r>
+    </w:p>
     <w:p/>
     <w:p>
       <w:pPr>
@@ -2545,6 +2560,7 @@
         <w:ind w:left="0" w:firstLine="0"/>
       </w:pPr>
       <w:r>
+        <w:lastRenderedPageBreak/>
         <w:t>Wednesday August 5</w:t>
       </w:r>
     </w:p>
@@ -2590,7 +2606,6 @@
         <w:ind w:left="0" w:firstLine="0"/>
       </w:pPr>
       <w:r>
-        <w:lastRenderedPageBreak/>
         <w:t>3:30-4PM (30 mins)</w:t>
       </w:r>
     </w:p>
@@ -2634,7 +2649,21 @@
         <w:t xml:space="preserve"> repo.</w:t>
       </w:r>
     </w:p>
-    <w:p/>
+    <w:p>
+      <w:r>
+        <w:t>Friday August 7</w:t>
+      </w:r>
+    </w:p>
+    <w:p>
+      <w:r>
+        <w:t>9:00 – 10:15 (1 hr 15)</w:t>
+      </w:r>
+    </w:p>
+    <w:p>
+      <w:r>
+        <w:t>Consolidating the work on our proposal so far, merging the tasks Sam and Olivia had worked on, formatting the document, and adding references</w:t>
+      </w:r>
+    </w:p>
     <w:sectPr>
       <w:headerReference w:type="default" r:id="rId9"/>
       <w:footerReference w:type="even" r:id="rId10"/>

</xml_diff>